<commit_message>
LTF: update both book covers with accurate descriptions
Fixed Book 2's cover, which was still an unedited duplicate of Book 1
labelled "Let's Talk Finance 1" with Book 1's description. Both covers
now correctly show "Let's Talk Finance 1" / "Let's Talk Finance 2" and
describe the actual current article structure (vocabulary focus,
reading and discussion questions, numbered source notes) instead of
the old generic template description.

Edited directly via Word COM against the existing DOCX files (a
front+back cover spread with the blurb in a floating text-box shape),
preserving all other formatting. Caught and fixed a text-box overflow
from the first draft's longer wording before finalizing.

Co-Authored-By: Claude Sonnet 5 <noreply@anthropic.com>
</commit_message>
<xml_diff>
--- a/books/Let's Talk Finance/cover/Let's Talk Finance 1 - Cover.docx
+++ b/books/Let's Talk Finance/cover/Let's Talk Finance 1 - Cover.docx
@@ -54,7 +54,7 @@
                               <w:spacing w:after="0" w:line="216" w:lineRule="auto"/>
                               <w:jc w:val="center"/>
                               <w:rPr>
-                                <w:rFonts w:ascii="Segoe UI Black" w:hAnsi="Segoe UI Black" w:cs="Segoe UI Semibold" w:hint="eastAsia"/>
+                                <w:rFonts w:ascii="Segoe UI Black" w:hAnsi="Segoe UI Black" w:cs="Segoe UI Semibold"/>
                                 <w:color w:val="FDE047"/>
                                 <w:sz w:val="192"/>
                                 <w:szCs w:val="192"/>
@@ -638,7 +638,7 @@
                                 <w:sz w:val="32"/>
                                 <w:szCs w:val="32"/>
                               </w:rPr>
-                              <w:t xml:space="preserve"> presents 20 engaging reading articles on real-world financial themes. Each unit develops both knowledge and language skills through carefully structured reading passages followed by upper-intermediate level discussion questions that promote critical thinking and debate.</w:t>
+                              <w:t xml:space="preserve"> presents 20 reading articles on real-world financial themes. Each topic pairs a carefully sourced reading with a vocabulary focus, reading-comprehension questions and upper-intermediate level discussion questions that promote critical thinking and debate, all backed by numbered source notes.</w:t>
                             </w:r>
                           </w:p>
                           <w:p>
@@ -679,7 +679,11 @@
           </mc:Choice>
           <mc:Fallback>
             <w:pict>
-              <v:shape w14:anchorId="5A7296D7" id="_x0000_s1029" type="#_x0000_t202" style="position:absolute;margin-left:88.75pt;margin-top:127.6pt;width:361.15pt;height:346.1pt;z-index:251659264;visibility:visible;mso-wrap-style:square;mso-width-percent:0;mso-height-percent:0;mso-wrap-distance-left:9pt;mso-wrap-distance-top:3.6pt;mso-wrap-distance-right:9pt;mso-wrap-distance-bottom:3.6pt;mso-position-horizontal:absolute;mso-position-horizontal-relative:text;mso-position-vertical:absolute;mso-position-vertical-relative:text;mso-width-percent:0;mso-height-percent:0;mso-width-relative:margin;mso-height-relative:margin;v-text-anchor:top" o:gfxdata="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" filled="f" stroked="f">
+              <v:shapetype w14:anchorId="5A7296D7" id="_x0000_t202" coordsize="21600,21600" o:spt="202" path="m,l,21600r21600,l21600,xe">
+                <v:stroke joinstyle="miter"/>
+                <v:path gradientshapeok="t" o:connecttype="rect"/>
+              </v:shapetype>
+              <v:shape id="_x0000_s1029" type="#_x0000_t202" style="position:absolute;margin-left:88.75pt;margin-top:127.6pt;width:361.15pt;height:346.1pt;z-index:251659264;visibility:visible;mso-wrap-style:square;mso-width-percent:0;mso-height-percent:0;mso-wrap-distance-left:9pt;mso-wrap-distance-top:3.6pt;mso-wrap-distance-right:9pt;mso-wrap-distance-bottom:3.6pt;mso-position-horizontal:absolute;mso-position-horizontal-relative:text;mso-position-vertical:absolute;mso-position-vertical-relative:text;mso-width-percent:0;mso-height-percent:0;mso-width-relative:margin;mso-height-relative:margin;v-text-anchor:top" o:gfxdata="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" filled="f" stroked="f">
                 <v:textbox>
                   <w:txbxContent>
                     <w:p>
@@ -720,7 +724,7 @@
                           <w:sz w:val="32"/>
                           <w:szCs w:val="32"/>
                         </w:rPr>
-                        <w:t xml:space="preserve"> presents 20 engaging reading articles on real-world financial themes. Each unit develops both knowledge and language skills through carefully structured reading passages followed by upper-intermediate level discussion questions that promote critical thinking and debate.</w:t>
+                        <w:t xml:space="preserve"> presents 20 reading articles on real-world financial themes. Each topic pairs a carefully sourced reading with a vocabulary focus, reading-comprehension questions and upper-intermediate level discussion questions that promote critical thinking and debate, all backed by numbered source notes.</w:t>
                       </w:r>
                     </w:p>
                     <w:p>

</xml_diff>

<commit_message>
updated covers for LTF
</commit_message>
<xml_diff>
--- a/books/Let's Talk Finance/cover/Let's Talk Finance 1 - Cover.docx
+++ b/books/Let's Talk Finance/cover/Let's Talk Finance 1 - Cover.docx
@@ -10,16 +10,416 @@
         <mc:AlternateContent>
           <mc:Choice Requires="wps">
             <w:drawing>
-              <wp:anchor distT="45720" distB="45720" distL="114300" distR="114300" simplePos="0" relativeHeight="251664384" behindDoc="0" locked="0" layoutInCell="1" allowOverlap="1" wp14:anchorId="7A84AB10" wp14:editId="7D779D37">
+              <wp:anchor distT="45720" distB="45720" distL="114300" distR="114300" simplePos="0" relativeHeight="251659264" behindDoc="0" locked="0" layoutInCell="1" allowOverlap="1" wp14:anchorId="5A7296D7" wp14:editId="6A03C22F">
                 <wp:simplePos x="0" y="0"/>
-                <wp:positionH relativeFrom="column">
-                  <wp:posOffset>8105775</wp:posOffset>
+                <wp:positionH relativeFrom="page">
+                  <wp:posOffset>1080135</wp:posOffset>
                 </wp:positionH>
-                <wp:positionV relativeFrom="paragraph">
-                  <wp:posOffset>932180</wp:posOffset>
+                <wp:positionV relativeFrom="page">
+                  <wp:posOffset>1440180</wp:posOffset>
                 </wp:positionV>
-                <wp:extent cx="2360930" cy="2679700"/>
-                <wp:effectExtent l="0" t="0" r="0" b="6350"/>
+                <wp:extent cx="5400000" cy="6573600"/>
+                <wp:effectExtent l="0" t="0" r="0" b="0"/>
+                <wp:wrapSquare wrapText="bothSides"/>
+                <wp:docPr id="217" name="Text Box 2"/>
+                <wp:cNvGraphicFramePr>
+                  <a:graphicFrameLocks xmlns:a="http://schemas.openxmlformats.org/drawingml/2006/main"/>
+                </wp:cNvGraphicFramePr>
+                <a:graphic xmlns:a="http://schemas.openxmlformats.org/drawingml/2006/main">
+                  <a:graphicData uri="http://schemas.microsoft.com/office/word/2010/wordprocessingShape">
+                    <wps:wsp>
+                      <wps:cNvSpPr txBox="1">
+                        <a:spLocks noChangeArrowheads="1"/>
+                      </wps:cNvSpPr>
+                      <wps:spPr bwMode="auto">
+                        <a:xfrm>
+                          <a:off x="0" y="0"/>
+                          <a:ext cx="5400000" cy="6573600"/>
+                        </a:xfrm>
+                        <a:prstGeom prst="rect">
+                          <a:avLst/>
+                        </a:prstGeom>
+                        <a:noFill/>
+                        <a:ln w="9525">
+                          <a:noFill/>
+                          <a:miter lim="800000"/>
+                          <a:headEnd/>
+                          <a:tailEnd/>
+                        </a:ln>
+                      </wps:spPr>
+                      <wps:txbx>
+                        <w:txbxContent>
+                          <w:p>
+                            <w:pPr>
+                              <w:rPr>
+                                <w:rFonts w:ascii="Segoe UI" w:hAnsi="Segoe UI" w:cs="Segoe UI"/>
+                                <w:color w:val="CBD5E1"/>
+                                <w:sz w:val="32"/>
+                                <w:szCs w:val="32"/>
+                              </w:rPr>
+                            </w:pPr>
+                            <w:r>
+                              <w:rPr>
+                                <w:rFonts w:ascii="Segoe UI" w:hAnsi="Segoe UI" w:cs="Segoe UI"/>
+                                <w:b/>
+                                <w:bCs/>
+                                <w:color w:val="CBD5E1"/>
+                                <w:sz w:val="32"/>
+                                <w:szCs w:val="32"/>
+                              </w:rPr>
+                              <w:t>Let’s Talk Finance</w:t>
+                            </w:r>
+                            <w:r>
+                              <w:rPr>
+                                <w:rFonts w:ascii="Segoe UI" w:hAnsi="Segoe UI" w:cs="Segoe UI" w:hint="eastAsia"/>
+                                <w:b/>
+                                <w:bCs/>
+                                <w:color w:val="CBD5E1"/>
+                                <w:sz w:val="32"/>
+                                <w:szCs w:val="32"/>
+                              </w:rPr>
+                              <w:t xml:space="preserve"> 1</w:t>
+                            </w:r>
+                            <w:r>
+                              <w:rPr>
+                                <w:rFonts w:ascii="Segoe UI" w:hAnsi="Segoe UI" w:cs="Segoe UI"/>
+                                <w:color w:val="CBD5E1"/>
+                                <w:sz w:val="32"/>
+                                <w:szCs w:val="32"/>
+                              </w:rPr>
+                              <w:t xml:space="preserve"> presents 20 reading articles on real-world financial themes. Each topic pairs a carefully sourced reading with a vocabulary focus, reading-comprehension questions and upper-intermediate level discussion questions that promote critical thinking and debate, all backed by numbered source notes.</w:t>
+                            </w:r>
+                          </w:p>
+                          <w:p>
+                            <w:pPr>
+                              <w:rPr>
+                                <w:rFonts w:ascii="Segoe UI" w:hAnsi="Segoe UI" w:cs="Segoe UI"/>
+                                <w:color w:val="CBD5E1"/>
+                                <w:sz w:val="32"/>
+                                <w:szCs w:val="32"/>
+                              </w:rPr>
+                            </w:pPr>
+                            <w:r>
+                              <w:rPr>
+                                <w:rFonts w:ascii="Segoe UI" w:hAnsi="Segoe UI" w:cs="Segoe UI"/>
+                                <w:color w:val="CBD5E1"/>
+                                <w:sz w:val="32"/>
+                                <w:szCs w:val="32"/>
+                              </w:rPr>
+                              <w:t>Designed for upper-intermediate learners and above, this textbook is perfect for students and professionals who wish to sharpen their English fluency while deepening their understanding of key finance concepts.</w:t>
+                            </w:r>
+                          </w:p>
+                          <w:p>
+                            <w:pPr>
+                              <w:rPr>
+                                <w:rFonts w:ascii="Segoe UI" w:hAnsi="Segoe UI" w:cs="Segoe UI"/>
+                                <w:color w:val="CBD5E1"/>
+                                <w:sz w:val="32"/>
+                                <w:szCs w:val="32"/>
+                              </w:rPr>
+                            </w:pPr>
+                          </w:p>
+                          <w:p>
+                            <w:pPr>
+                              <w:spacing w:after="0"/>
+                              <w:rPr>
+                                <w:rFonts w:ascii="Segoe UI" w:hAnsi="Segoe UI" w:cs="Segoe UI"/>
+                                <w:color w:val="CBD5E1"/>
+                                <w:sz w:val="32"/>
+                                <w:szCs w:val="32"/>
+                              </w:rPr>
+                            </w:pPr>
+                            <w:r>
+                              <w:rPr>
+                                <w:rFonts w:ascii="Segoe UI" w:hAnsi="Segoe UI" w:cs="Segoe UI"/>
+                                <w:color w:val="CBD5E1"/>
+                                <w:sz w:val="32"/>
+                                <w:szCs w:val="32"/>
+                              </w:rPr>
+                              <w:t>Part 1: Money, Payments and Financial Technology</w:t>
+                            </w:r>
+                          </w:p>
+                          <w:p>
+                            <w:pPr>
+                              <w:spacing w:after="0"/>
+                              <w:rPr>
+                                <w:rFonts w:ascii="Segoe UI" w:hAnsi="Segoe UI" w:cs="Segoe UI"/>
+                                <w:color w:val="CBD5E1"/>
+                                <w:sz w:val="32"/>
+                                <w:szCs w:val="32"/>
+                              </w:rPr>
+                            </w:pPr>
+                            <w:r>
+                              <w:rPr>
+                                <w:rFonts w:ascii="Segoe UI" w:hAnsi="Segoe UI" w:cs="Segoe UI"/>
+                                <w:color w:val="CBD5E1"/>
+                                <w:sz w:val="32"/>
+                                <w:szCs w:val="32"/>
+                              </w:rPr>
+                              <w:t>Part 2: Markets, Institutions and Financial Stability</w:t>
+                            </w:r>
+                          </w:p>
+                          <w:p>
+                            <w:pPr>
+                              <w:spacing w:after="0"/>
+                              <w:rPr>
+                                <w:rFonts w:ascii="Segoe UI" w:hAnsi="Segoe UI" w:cs="Segoe UI"/>
+                                <w:color w:val="CBD5E1"/>
+                                <w:sz w:val="32"/>
+                                <w:szCs w:val="32"/>
+                              </w:rPr>
+                            </w:pPr>
+                            <w:r>
+                              <w:rPr>
+                                <w:rFonts w:ascii="Segoe UI" w:hAnsi="Segoe UI" w:cs="Segoe UI"/>
+                                <w:color w:val="CBD5E1"/>
+                                <w:sz w:val="32"/>
+                                <w:szCs w:val="32"/>
+                              </w:rPr>
+                              <w:t>Part 3: Capital, Investment and Public Policy</w:t>
+                            </w:r>
+                          </w:p>
+                          <w:p>
+                            <w:pPr>
+                              <w:spacing w:after="0"/>
+                              <w:rPr>
+                                <w:rFonts w:ascii="Segoe UI" w:hAnsi="Segoe UI" w:cs="Segoe UI"/>
+                                <w:color w:val="CBD5E1"/>
+                                <w:sz w:val="32"/>
+                                <w:szCs w:val="32"/>
+                              </w:rPr>
+                            </w:pPr>
+                            <w:r>
+                              <w:rPr>
+                                <w:rFonts w:ascii="Segoe UI" w:hAnsi="Segoe UI" w:cs="Segoe UI"/>
+                                <w:color w:val="CBD5E1"/>
+                                <w:sz w:val="32"/>
+                                <w:szCs w:val="32"/>
+                              </w:rPr>
+                              <w:t>Part 4: Finance, Fairness and Global Cooperation</w:t>
+                            </w:r>
+                          </w:p>
+                          <w:p>
+                            <w:pPr>
+                              <w:rPr>
+                                <w:rFonts w:ascii="Segoe UI" w:hAnsi="Segoe UI" w:cs="Segoe UI"/>
+                                <w:color w:val="CBD5E1"/>
+                                <w:sz w:val="32"/>
+                                <w:szCs w:val="32"/>
+                              </w:rPr>
+                            </w:pPr>
+                          </w:p>
+                        </w:txbxContent>
+                      </wps:txbx>
+                      <wps:bodyPr rot="0" vert="horz" wrap="square" lIns="91440" tIns="45720" rIns="91440" bIns="45720" anchor="t" anchorCtr="0">
+                        <a:noAutofit/>
+                      </wps:bodyPr>
+                    </wps:wsp>
+                  </a:graphicData>
+                </a:graphic>
+                <wp14:sizeRelH relativeFrom="margin">
+                  <wp14:pctWidth>0</wp14:pctWidth>
+                </wp14:sizeRelH>
+                <wp14:sizeRelV relativeFrom="margin">
+                  <wp14:pctHeight>0</wp14:pctHeight>
+                </wp14:sizeRelV>
+              </wp:anchor>
+            </w:drawing>
+          </mc:Choice>
+          <mc:Fallback>
+            <w:pict>
+              <v:shapetype w14:anchorId="5A7296D7" id="_x0000_t202" coordsize="21600,21600" o:spt="202" path="m,l,21600r21600,l21600,xe">
+                <v:stroke joinstyle="miter"/>
+                <v:path gradientshapeok="t" o:connecttype="rect"/>
+              </v:shapetype>
+              <v:shape id="Text Box 2" o:spid="_x0000_s1026" type="#_x0000_t202" style="position:absolute;margin-left:85.05pt;margin-top:113.4pt;width:425.2pt;height:517.6pt;z-index:251659264;visibility:visible;mso-wrap-style:square;mso-width-percent:0;mso-height-percent:0;mso-wrap-distance-left:9pt;mso-wrap-distance-top:3.6pt;mso-wrap-distance-right:9pt;mso-wrap-distance-bottom:3.6pt;mso-position-horizontal:absolute;mso-position-horizontal-relative:page;mso-position-vertical:absolute;mso-position-vertical-relative:page;mso-width-percent:0;mso-height-percent:0;mso-width-relative:margin;mso-height-relative:margin;v-text-anchor:top" o:gfxdata="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" filled="f" stroked="f">
+                <v:textbox>
+                  <w:txbxContent>
+                    <w:p>
+                      <w:pPr>
+                        <w:rPr>
+                          <w:rFonts w:ascii="Segoe UI" w:hAnsi="Segoe UI" w:cs="Segoe UI"/>
+                          <w:color w:val="CBD5E1"/>
+                          <w:sz w:val="32"/>
+                          <w:szCs w:val="32"/>
+                        </w:rPr>
+                      </w:pPr>
+                      <w:r>
+                        <w:rPr>
+                          <w:rFonts w:ascii="Segoe UI" w:hAnsi="Segoe UI" w:cs="Segoe UI"/>
+                          <w:b/>
+                          <w:bCs/>
+                          <w:color w:val="CBD5E1"/>
+                          <w:sz w:val="32"/>
+                          <w:szCs w:val="32"/>
+                        </w:rPr>
+                        <w:t>Let’s Talk Finance</w:t>
+                      </w:r>
+                      <w:r>
+                        <w:rPr>
+                          <w:rFonts w:ascii="Segoe UI" w:hAnsi="Segoe UI" w:cs="Segoe UI" w:hint="eastAsia"/>
+                          <w:b/>
+                          <w:bCs/>
+                          <w:color w:val="CBD5E1"/>
+                          <w:sz w:val="32"/>
+                          <w:szCs w:val="32"/>
+                        </w:rPr>
+                        <w:t xml:space="preserve"> 1</w:t>
+                      </w:r>
+                      <w:r>
+                        <w:rPr>
+                          <w:rFonts w:ascii="Segoe UI" w:hAnsi="Segoe UI" w:cs="Segoe UI"/>
+                          <w:color w:val="CBD5E1"/>
+                          <w:sz w:val="32"/>
+                          <w:szCs w:val="32"/>
+                        </w:rPr>
+                        <w:t xml:space="preserve"> presents 20 reading articles on real-world financial themes. Each topic pairs a carefully sourced reading with a vocabulary focus, reading-comprehension questions and upper-intermediate level discussion questions that promote critical thinking and debate, all backed by numbered source notes.</w:t>
+                      </w:r>
+                    </w:p>
+                    <w:p>
+                      <w:pPr>
+                        <w:rPr>
+                          <w:rFonts w:ascii="Segoe UI" w:hAnsi="Segoe UI" w:cs="Segoe UI"/>
+                          <w:color w:val="CBD5E1"/>
+                          <w:sz w:val="32"/>
+                          <w:szCs w:val="32"/>
+                        </w:rPr>
+                      </w:pPr>
+                      <w:r>
+                        <w:rPr>
+                          <w:rFonts w:ascii="Segoe UI" w:hAnsi="Segoe UI" w:cs="Segoe UI"/>
+                          <w:color w:val="CBD5E1"/>
+                          <w:sz w:val="32"/>
+                          <w:szCs w:val="32"/>
+                        </w:rPr>
+                        <w:t>Designed for upper-intermediate learners and above, this textbook is perfect for students and professionals who wish to sharpen their English fluency while deepening their understanding of key finance concepts.</w:t>
+                      </w:r>
+                    </w:p>
+                    <w:p>
+                      <w:pPr>
+                        <w:rPr>
+                          <w:rFonts w:ascii="Segoe UI" w:hAnsi="Segoe UI" w:cs="Segoe UI"/>
+                          <w:color w:val="CBD5E1"/>
+                          <w:sz w:val="32"/>
+                          <w:szCs w:val="32"/>
+                        </w:rPr>
+                      </w:pPr>
+                    </w:p>
+                    <w:p>
+                      <w:pPr>
+                        <w:spacing w:after="0"/>
+                        <w:rPr>
+                          <w:rFonts w:ascii="Segoe UI" w:hAnsi="Segoe UI" w:cs="Segoe UI"/>
+                          <w:color w:val="CBD5E1"/>
+                          <w:sz w:val="32"/>
+                          <w:szCs w:val="32"/>
+                        </w:rPr>
+                      </w:pPr>
+                      <w:r>
+                        <w:rPr>
+                          <w:rFonts w:ascii="Segoe UI" w:hAnsi="Segoe UI" w:cs="Segoe UI"/>
+                          <w:color w:val="CBD5E1"/>
+                          <w:sz w:val="32"/>
+                          <w:szCs w:val="32"/>
+                        </w:rPr>
+                        <w:t>Part 1: Money, Payments and Financial Technology</w:t>
+                      </w:r>
+                    </w:p>
+                    <w:p>
+                      <w:pPr>
+                        <w:spacing w:after="0"/>
+                        <w:rPr>
+                          <w:rFonts w:ascii="Segoe UI" w:hAnsi="Segoe UI" w:cs="Segoe UI"/>
+                          <w:color w:val="CBD5E1"/>
+                          <w:sz w:val="32"/>
+                          <w:szCs w:val="32"/>
+                        </w:rPr>
+                      </w:pPr>
+                      <w:r>
+                        <w:rPr>
+                          <w:rFonts w:ascii="Segoe UI" w:hAnsi="Segoe UI" w:cs="Segoe UI"/>
+                          <w:color w:val="CBD5E1"/>
+                          <w:sz w:val="32"/>
+                          <w:szCs w:val="32"/>
+                        </w:rPr>
+                        <w:t>Part 2: Markets, Institutions and Financial Stability</w:t>
+                      </w:r>
+                    </w:p>
+                    <w:p>
+                      <w:pPr>
+                        <w:spacing w:after="0"/>
+                        <w:rPr>
+                          <w:rFonts w:ascii="Segoe UI" w:hAnsi="Segoe UI" w:cs="Segoe UI"/>
+                          <w:color w:val="CBD5E1"/>
+                          <w:sz w:val="32"/>
+                          <w:szCs w:val="32"/>
+                        </w:rPr>
+                      </w:pPr>
+                      <w:r>
+                        <w:rPr>
+                          <w:rFonts w:ascii="Segoe UI" w:hAnsi="Segoe UI" w:cs="Segoe UI"/>
+                          <w:color w:val="CBD5E1"/>
+                          <w:sz w:val="32"/>
+                          <w:szCs w:val="32"/>
+                        </w:rPr>
+                        <w:t>Part 3: Capital, Investment and Public Policy</w:t>
+                      </w:r>
+                    </w:p>
+                    <w:p>
+                      <w:pPr>
+                        <w:spacing w:after="0"/>
+                        <w:rPr>
+                          <w:rFonts w:ascii="Segoe UI" w:hAnsi="Segoe UI" w:cs="Segoe UI"/>
+                          <w:color w:val="CBD5E1"/>
+                          <w:sz w:val="32"/>
+                          <w:szCs w:val="32"/>
+                        </w:rPr>
+                      </w:pPr>
+                      <w:r>
+                        <w:rPr>
+                          <w:rFonts w:ascii="Segoe UI" w:hAnsi="Segoe UI" w:cs="Segoe UI"/>
+                          <w:color w:val="CBD5E1"/>
+                          <w:sz w:val="32"/>
+                          <w:szCs w:val="32"/>
+                        </w:rPr>
+                        <w:t>Part 4: Finance, Fairness and Global Cooperation</w:t>
+                      </w:r>
+                    </w:p>
+                    <w:p>
+                      <w:pPr>
+                        <w:rPr>
+                          <w:rFonts w:ascii="Segoe UI" w:hAnsi="Segoe UI" w:cs="Segoe UI"/>
+                          <w:color w:val="CBD5E1"/>
+                          <w:sz w:val="32"/>
+                          <w:szCs w:val="32"/>
+                        </w:rPr>
+                      </w:pPr>
+                    </w:p>
+                  </w:txbxContent>
+                </v:textbox>
+                <w10:wrap type="square" anchorx="page" anchory="page"/>
+              </v:shape>
+            </w:pict>
+          </mc:Fallback>
+        </mc:AlternateContent>
+      </w:r>
+      <w:r>
+        <w:rPr>
+          <w:noProof/>
+        </w:rPr>
+        <mc:AlternateContent>
+          <mc:Choice Requires="wps">
+            <w:drawing>
+              <wp:anchor distT="45720" distB="45720" distL="114300" distR="114300" simplePos="0" relativeHeight="251664384" behindDoc="0" locked="0" layoutInCell="1" allowOverlap="1" wp14:anchorId="7A84AB10" wp14:editId="623DD1F3">
+                <wp:simplePos x="0" y="0"/>
+                <wp:positionH relativeFrom="page">
+                  <wp:posOffset>8461375</wp:posOffset>
+                </wp:positionH>
+                <wp:positionV relativeFrom="page">
+                  <wp:posOffset>1296035</wp:posOffset>
+                </wp:positionV>
+                <wp:extent cx="5850000" cy="2678400"/>
+                <wp:effectExtent l="0" t="0" r="0" b="0"/>
                 <wp:wrapSquare wrapText="bothSides"/>
                 <wp:docPr id="877386829" name="Text Box 2"/>
                 <wp:cNvGraphicFramePr>
@@ -34,7 +434,7 @@
                       <wps:spPr bwMode="auto">
                         <a:xfrm>
                           <a:off x="0" y="0"/>
-                          <a:ext cx="2360930" cy="2679700"/>
+                          <a:ext cx="5850000" cy="2678400"/>
                         </a:xfrm>
                         <a:prstGeom prst="rect">
                           <a:avLst/>
@@ -54,7 +454,7 @@
                               <w:spacing w:after="0" w:line="216" w:lineRule="auto"/>
                               <w:jc w:val="center"/>
                               <w:rPr>
-                                <w:rFonts w:ascii="Segoe UI Black" w:hAnsi="Segoe UI Black" w:cs="Segoe UI Semibold"/>
+                                <w:rFonts w:ascii="Segoe UI Black" w:hAnsi="Segoe UI Black" w:cs="Segoe UI Semibold" w:hint="eastAsia"/>
                                 <w:color w:val="FDE047"/>
                                 <w:sz w:val="192"/>
                                 <w:szCs w:val="192"/>
@@ -86,6 +486,15 @@
                                 <w:szCs w:val="192"/>
                               </w:rPr>
                               <w:t>Finance</w:t>
+                            </w:r>
+                            <w:r>
+                              <w:rPr>
+                                <w:rFonts w:ascii="Segoe UI Black" w:hAnsi="Segoe UI Black" w:cs="Segoe UI Semibold" w:hint="eastAsia"/>
+                                <w:color w:val="FDE047"/>
+                                <w:sz w:val="192"/>
+                                <w:szCs w:val="192"/>
+                              </w:rPr>
+                              <w:t xml:space="preserve"> 1</w:t>
                             </w:r>
                           </w:p>
                         </w:txbxContent>
@@ -97,7 +506,7 @@
                   </a:graphicData>
                 </a:graphic>
                 <wp14:sizeRelH relativeFrom="margin">
-                  <wp14:pctWidth>40000</wp14:pctWidth>
+                  <wp14:pctWidth>0</wp14:pctWidth>
                 </wp14:sizeRelH>
                 <wp14:sizeRelV relativeFrom="margin">
                   <wp14:pctHeight>0</wp14:pctHeight>
@@ -107,11 +516,7 @@
           </mc:Choice>
           <mc:Fallback>
             <w:pict>
-              <v:shapetype w14:anchorId="7A84AB10" id="_x0000_t202" coordsize="21600,21600" o:spt="202" path="m,l,21600r21600,l21600,xe">
-                <v:stroke joinstyle="miter"/>
-                <v:path gradientshapeok="t" o:connecttype="rect"/>
-              </v:shapetype>
-              <v:shape id="Text Box 2" o:spid="_x0000_s1026" type="#_x0000_t202" style="position:absolute;margin-left:638.25pt;margin-top:73.4pt;width:185.9pt;height:211pt;z-index:251664384;visibility:visible;mso-wrap-style:square;mso-width-percent:400;mso-height-percent:0;mso-wrap-distance-left:9pt;mso-wrap-distance-top:3.6pt;mso-wrap-distance-right:9pt;mso-wrap-distance-bottom:3.6pt;mso-position-horizontal:absolute;mso-position-horizontal-relative:text;mso-position-vertical:absolute;mso-position-vertical-relative:text;mso-width-percent:400;mso-height-percent:0;mso-width-relative:margin;mso-height-relative:margin;v-text-anchor:top" o:gfxdata="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" filled="f" stroked="f">
+              <v:shape w14:anchorId="7A84AB10" id="_x0000_s1027" type="#_x0000_t202" style="position:absolute;margin-left:666.25pt;margin-top:102.05pt;width:460.65pt;height:210.9pt;z-index:251664384;visibility:visible;mso-wrap-style:square;mso-width-percent:0;mso-height-percent:0;mso-wrap-distance-left:9pt;mso-wrap-distance-top:3.6pt;mso-wrap-distance-right:9pt;mso-wrap-distance-bottom:3.6pt;mso-position-horizontal:absolute;mso-position-horizontal-relative:page;mso-position-vertical:absolute;mso-position-vertical-relative:page;mso-width-percent:0;mso-height-percent:0;mso-width-relative:margin;mso-height-relative:margin;v-text-anchor:top" o:gfxdata="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" filled="f" stroked="f">
                 <v:textbox>
                   <w:txbxContent>
                     <w:p>
@@ -152,10 +557,19 @@
                         </w:rPr>
                         <w:t>Finance</w:t>
                       </w:r>
+                      <w:r>
+                        <w:rPr>
+                          <w:rFonts w:ascii="Segoe UI Black" w:hAnsi="Segoe UI Black" w:cs="Segoe UI Semibold" w:hint="eastAsia"/>
+                          <w:color w:val="FDE047"/>
+                          <w:sz w:val="192"/>
+                          <w:szCs w:val="192"/>
+                        </w:rPr>
+                        <w:t xml:space="preserve"> 1</w:t>
+                      </w:r>
                     </w:p>
                   </w:txbxContent>
                 </v:textbox>
-                <w10:wrap type="square"/>
+                <w10:wrap type="square" anchorx="page" anchory="page"/>
               </v:shape>
             </w:pict>
           </mc:Fallback>
@@ -279,7 +693,7 @@
           </mc:Choice>
           <mc:Fallback>
             <w:pict>
-              <v:shape w14:anchorId="271ED558" id="_x0000_s1027" type="#_x0000_t202" style="position:absolute;margin-left:618.05pt;margin-top:415.65pt;width:493.5pt;height:110.6pt;z-index:251666432;visibility:visible;mso-wrap-style:square;mso-width-percent:0;mso-height-percent:200;mso-wrap-distance-left:9pt;mso-wrap-distance-top:3.6pt;mso-wrap-distance-right:9pt;mso-wrap-distance-bottom:3.6pt;mso-position-horizontal:absolute;mso-position-horizontal-relative:text;mso-position-vertical:absolute;mso-position-vertical-relative:text;mso-width-percent:0;mso-height-percent:200;mso-width-relative:margin;mso-height-relative:margin;v-text-anchor:top" o:gfxdata="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" filled="f" stroked="f">
+              <v:shape w14:anchorId="271ED558" id="_x0000_s1028" type="#_x0000_t202" style="position:absolute;margin-left:618.05pt;margin-top:415.65pt;width:493.5pt;height:110.6pt;z-index:251666432;visibility:visible;mso-wrap-style:square;mso-width-percent:0;mso-height-percent:200;mso-wrap-distance-left:9pt;mso-wrap-distance-top:3.6pt;mso-wrap-distance-right:9pt;mso-wrap-distance-bottom:3.6pt;mso-position-horizontal:absolute;mso-position-horizontal-relative:text;mso-position-vertical:absolute;mso-position-vertical-relative:text;mso-width-percent:0;mso-height-percent:200;mso-width-relative:margin;mso-height-relative:margin;v-text-anchor:top" o:gfxdata="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" filled="f" stroked="f">
                 <v:textbox style="mso-fit-shape-to-text:t">
                   <w:txbxContent>
                     <w:p>
@@ -445,7 +859,7 @@
           </mc:Choice>
           <mc:Fallback>
             <w:pict>
-              <v:shape w14:anchorId="33DB0847" id="_x0000_s1028" type="#_x0000_t202" style="position:absolute;margin-left:637.45pt;margin-top:740.3pt;width:185.9pt;height:45pt;z-index:251668480;visibility:visible;mso-wrap-style:square;mso-width-percent:400;mso-height-percent:0;mso-wrap-distance-left:9pt;mso-wrap-distance-top:3.6pt;mso-wrap-distance-right:9pt;mso-wrap-distance-bottom:3.6pt;mso-position-horizontal:absolute;mso-position-horizontal-relative:margin;mso-position-vertical:absolute;mso-position-vertical-relative:margin;mso-width-percent:400;mso-height-percent:0;mso-width-relative:margin;mso-height-relative:margin;v-text-anchor:top" o:gfxdata="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" filled="f" stroked="f">
+              <v:shape w14:anchorId="33DB0847" id="_x0000_s1029" type="#_x0000_t202" style="position:absolute;margin-left:637.45pt;margin-top:740.3pt;width:185.9pt;height:45pt;z-index:251668480;visibility:visible;mso-wrap-style:square;mso-width-percent:400;mso-height-percent:0;mso-wrap-distance-left:9pt;mso-wrap-distance-top:3.6pt;mso-wrap-distance-right:9pt;mso-wrap-distance-bottom:3.6pt;mso-position-horizontal:absolute;mso-position-horizontal-relative:margin;mso-position-vertical:absolute;mso-position-vertical-relative:margin;mso-width-percent:400;mso-height-percent:0;mso-width-relative:margin;mso-height-relative:margin;v-text-anchor:top" o:gfxdata="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" filled="f" stroked="f">
                 <v:textbox>
                   <w:txbxContent>
                     <w:p>
@@ -499,7 +913,7 @@
           <w:noProof/>
         </w:rPr>
         <w:drawing>
-          <wp:anchor distT="0" distB="0" distL="114300" distR="114300" simplePos="0" relativeHeight="251660288" behindDoc="0" locked="0" layoutInCell="1" allowOverlap="1" wp14:anchorId="7AE10234" wp14:editId="1C982A75">
+          <wp:anchor distT="0" distB="0" distL="114300" distR="114300" simplePos="0" relativeHeight="251660288" behindDoc="0" locked="0" layoutInCell="1" allowOverlap="1" wp14:anchorId="7AE10234" wp14:editId="677DF3F9">
             <wp:simplePos x="0" y="0"/>
             <wp:positionH relativeFrom="margin">
               <wp:posOffset>2332990</wp:posOffset>
@@ -553,206 +967,6 @@
             </wp14:sizeRelV>
           </wp:anchor>
         </w:drawing>
-      </w:r>
-      <w:r>
-        <w:rPr>
-          <w:noProof/>
-        </w:rPr>
-        <mc:AlternateContent>
-          <mc:Choice Requires="wps">
-            <w:drawing>
-              <wp:anchor distT="45720" distB="45720" distL="114300" distR="114300" simplePos="0" relativeHeight="251659264" behindDoc="0" locked="0" layoutInCell="1" allowOverlap="1" wp14:anchorId="5A7296D7" wp14:editId="14A183AD">
-                <wp:simplePos x="0" y="0"/>
-                <wp:positionH relativeFrom="column">
-                  <wp:posOffset>1127125</wp:posOffset>
-                </wp:positionH>
-                <wp:positionV relativeFrom="paragraph">
-                  <wp:posOffset>1620520</wp:posOffset>
-                </wp:positionV>
-                <wp:extent cx="4586400" cy="4395600"/>
-                <wp:effectExtent l="0" t="0" r="0" b="5080"/>
-                <wp:wrapSquare wrapText="bothSides"/>
-                <wp:docPr id="217" name="Text Box 2"/>
-                <wp:cNvGraphicFramePr>
-                  <a:graphicFrameLocks xmlns:a="http://schemas.openxmlformats.org/drawingml/2006/main"/>
-                </wp:cNvGraphicFramePr>
-                <a:graphic xmlns:a="http://schemas.openxmlformats.org/drawingml/2006/main">
-                  <a:graphicData uri="http://schemas.microsoft.com/office/word/2010/wordprocessingShape">
-                    <wps:wsp>
-                      <wps:cNvSpPr txBox="1">
-                        <a:spLocks noChangeArrowheads="1"/>
-                      </wps:cNvSpPr>
-                      <wps:spPr bwMode="auto">
-                        <a:xfrm>
-                          <a:off x="0" y="0"/>
-                          <a:ext cx="4586400" cy="4395600"/>
-                        </a:xfrm>
-                        <a:prstGeom prst="rect">
-                          <a:avLst/>
-                        </a:prstGeom>
-                        <a:noFill/>
-                        <a:ln w="9525">
-                          <a:noFill/>
-                          <a:miter lim="800000"/>
-                          <a:headEnd/>
-                          <a:tailEnd/>
-                        </a:ln>
-                      </wps:spPr>
-                      <wps:txbx>
-                        <w:txbxContent>
-                          <w:p>
-                            <w:pPr>
-                              <w:rPr>
-                                <w:rFonts w:ascii="Segoe UI" w:hAnsi="Segoe UI" w:cs="Segoe UI"/>
-                                <w:color w:val="CBD5E1"/>
-                                <w:sz w:val="32"/>
-                                <w:szCs w:val="32"/>
-                              </w:rPr>
-                            </w:pPr>
-                            <w:r>
-                              <w:rPr>
-                                <w:rFonts w:ascii="Segoe UI" w:hAnsi="Segoe UI" w:cs="Segoe UI"/>
-                                <w:b/>
-                                <w:bCs/>
-                                <w:color w:val="CBD5E1"/>
-                                <w:sz w:val="32"/>
-                                <w:szCs w:val="32"/>
-                              </w:rPr>
-                              <w:t>Let’s Talk Finance</w:t>
-                            </w:r>
-                            <w:r>
-                              <w:rPr>
-                                <w:rFonts w:ascii="Segoe UI" w:hAnsi="Segoe UI" w:cs="Segoe UI" w:hint="eastAsia"/>
-                                <w:b/>
-                                <w:bCs/>
-                                <w:color w:val="CBD5E1"/>
-                                <w:sz w:val="32"/>
-                                <w:szCs w:val="32"/>
-                              </w:rPr>
-                              <w:t xml:space="preserve"> 1</w:t>
-                            </w:r>
-                            <w:r>
-                              <w:rPr>
-                                <w:rFonts w:ascii="Segoe UI" w:hAnsi="Segoe UI" w:cs="Segoe UI"/>
-                                <w:color w:val="CBD5E1"/>
-                                <w:sz w:val="32"/>
-                                <w:szCs w:val="32"/>
-                              </w:rPr>
-                              <w:t xml:space="preserve"> presents 20 reading articles on real-world financial themes. Each topic pairs a carefully sourced reading with a vocabulary focus, reading-comprehension questions and upper-intermediate level discussion questions that promote critical thinking and debate, all backed by numbered source notes.</w:t>
-                            </w:r>
-                          </w:p>
-                          <w:p>
-                            <w:pPr>
-                              <w:rPr>
-                                <w:rFonts w:ascii="Segoe UI" w:hAnsi="Segoe UI" w:cs="Segoe UI"/>
-                                <w:color w:val="CBD5E1"/>
-                                <w:sz w:val="32"/>
-                                <w:szCs w:val="32"/>
-                              </w:rPr>
-                            </w:pPr>
-                            <w:r>
-                              <w:rPr>
-                                <w:rFonts w:ascii="Segoe UI" w:hAnsi="Segoe UI" w:cs="Segoe UI"/>
-                                <w:color w:val="CBD5E1"/>
-                                <w:sz w:val="32"/>
-                                <w:szCs w:val="32"/>
-                              </w:rPr>
-                              <w:t>Designed for upper-intermediate learners and above, this textbook is perfect for students and professionals who wish to sharpen their English fluency while deepening their understanding of key finance concepts.</w:t>
-                            </w:r>
-                          </w:p>
-                        </w:txbxContent>
-                      </wps:txbx>
-                      <wps:bodyPr rot="0" vert="horz" wrap="square" lIns="91440" tIns="45720" rIns="91440" bIns="45720" anchor="t" anchorCtr="0">
-                        <a:noAutofit/>
-                      </wps:bodyPr>
-                    </wps:wsp>
-                  </a:graphicData>
-                </a:graphic>
-                <wp14:sizeRelH relativeFrom="margin">
-                  <wp14:pctWidth>0</wp14:pctWidth>
-                </wp14:sizeRelH>
-                <wp14:sizeRelV relativeFrom="margin">
-                  <wp14:pctHeight>0</wp14:pctHeight>
-                </wp14:sizeRelV>
-              </wp:anchor>
-            </w:drawing>
-          </mc:Choice>
-          <mc:Fallback>
-            <w:pict>
-              <v:shapetype w14:anchorId="5A7296D7" id="_x0000_t202" coordsize="21600,21600" o:spt="202" path="m,l,21600r21600,l21600,xe">
-                <v:stroke joinstyle="miter"/>
-                <v:path gradientshapeok="t" o:connecttype="rect"/>
-              </v:shapetype>
-              <v:shape id="_x0000_s1029" type="#_x0000_t202" style="position:absolute;margin-left:88.75pt;margin-top:127.6pt;width:361.15pt;height:346.1pt;z-index:251659264;visibility:visible;mso-wrap-style:square;mso-width-percent:0;mso-height-percent:0;mso-wrap-distance-left:9pt;mso-wrap-distance-top:3.6pt;mso-wrap-distance-right:9pt;mso-wrap-distance-bottom:3.6pt;mso-position-horizontal:absolute;mso-position-horizontal-relative:text;mso-position-vertical:absolute;mso-position-vertical-relative:text;mso-width-percent:0;mso-height-percent:0;mso-width-relative:margin;mso-height-relative:margin;v-text-anchor:top" o:gfxdata="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" filled="f" stroked="f">
-                <v:textbox>
-                  <w:txbxContent>
-                    <w:p>
-                      <w:pPr>
-                        <w:rPr>
-                          <w:rFonts w:ascii="Segoe UI" w:hAnsi="Segoe UI" w:cs="Segoe UI"/>
-                          <w:color w:val="CBD5E1"/>
-                          <w:sz w:val="32"/>
-                          <w:szCs w:val="32"/>
-                        </w:rPr>
-                      </w:pPr>
-                      <w:r>
-                        <w:rPr>
-                          <w:rFonts w:ascii="Segoe UI" w:hAnsi="Segoe UI" w:cs="Segoe UI"/>
-                          <w:b/>
-                          <w:bCs/>
-                          <w:color w:val="CBD5E1"/>
-                          <w:sz w:val="32"/>
-                          <w:szCs w:val="32"/>
-                        </w:rPr>
-                        <w:t>Let’s Talk Finance</w:t>
-                      </w:r>
-                      <w:r>
-                        <w:rPr>
-                          <w:rFonts w:ascii="Segoe UI" w:hAnsi="Segoe UI" w:cs="Segoe UI" w:hint="eastAsia"/>
-                          <w:b/>
-                          <w:bCs/>
-                          <w:color w:val="CBD5E1"/>
-                          <w:sz w:val="32"/>
-                          <w:szCs w:val="32"/>
-                        </w:rPr>
-                        <w:t xml:space="preserve"> 1</w:t>
-                      </w:r>
-                      <w:r>
-                        <w:rPr>
-                          <w:rFonts w:ascii="Segoe UI" w:hAnsi="Segoe UI" w:cs="Segoe UI"/>
-                          <w:color w:val="CBD5E1"/>
-                          <w:sz w:val="32"/>
-                          <w:szCs w:val="32"/>
-                        </w:rPr>
-                        <w:t xml:space="preserve"> presents 20 reading articles on real-world financial themes. Each topic pairs a carefully sourced reading with a vocabulary focus, reading-comprehension questions and upper-intermediate level discussion questions that promote critical thinking and debate, all backed by numbered source notes.</w:t>
-                      </w:r>
-                    </w:p>
-                    <w:p>
-                      <w:pPr>
-                        <w:rPr>
-                          <w:rFonts w:ascii="Segoe UI" w:hAnsi="Segoe UI" w:cs="Segoe UI"/>
-                          <w:color w:val="CBD5E1"/>
-                          <w:sz w:val="32"/>
-                          <w:szCs w:val="32"/>
-                        </w:rPr>
-                      </w:pPr>
-                      <w:r>
-                        <w:rPr>
-                          <w:rFonts w:ascii="Segoe UI" w:hAnsi="Segoe UI" w:cs="Segoe UI"/>
-                          <w:color w:val="CBD5E1"/>
-                          <w:sz w:val="32"/>
-                          <w:szCs w:val="32"/>
-                        </w:rPr>
-                        <w:t>Designed for upper-intermediate learners and above, this textbook is perfect for students and professionals who wish to sharpen their English fluency while deepening their understanding of key finance concepts.</w:t>
-                      </w:r>
-                    </w:p>
-                  </w:txbxContent>
-                </v:textbox>
-                <w10:wrap type="square"/>
-              </v:shape>
-            </w:pict>
-          </mc:Fallback>
-        </mc:AlternateContent>
       </w:r>
       <w:r>
         <w:rPr>
@@ -1953,6 +2167,71 @@
     <w:uiPriority w:val="99"/>
     <w:rsid w:val="006F0627"/>
   </w:style>
+  <w:style w:type="paragraph" w:styleId="HTMLPreformatted">
+    <w:name w:val="HTML Preformatted"/>
+    <w:basedOn w:val="Normal"/>
+    <w:link w:val="HTMLPreformattedChar"/>
+    <w:uiPriority w:val="99"/>
+    <w:semiHidden/>
+    <w:unhideWhenUsed/>
+    <w:rsid w:val="00483158"/>
+    <w:pPr>
+      <w:tabs>
+        <w:tab w:val="left" w:pos="916"/>
+        <w:tab w:val="left" w:pos="1832"/>
+        <w:tab w:val="left" w:pos="2748"/>
+        <w:tab w:val="left" w:pos="3664"/>
+        <w:tab w:val="left" w:pos="4580"/>
+        <w:tab w:val="left" w:pos="5496"/>
+        <w:tab w:val="left" w:pos="6412"/>
+        <w:tab w:val="left" w:pos="7328"/>
+        <w:tab w:val="left" w:pos="8244"/>
+        <w:tab w:val="left" w:pos="9160"/>
+        <w:tab w:val="left" w:pos="10076"/>
+        <w:tab w:val="left" w:pos="10992"/>
+        <w:tab w:val="left" w:pos="11908"/>
+        <w:tab w:val="left" w:pos="12824"/>
+        <w:tab w:val="left" w:pos="13740"/>
+        <w:tab w:val="left" w:pos="14656"/>
+      </w:tabs>
+      <w:spacing w:after="0" w:line="240" w:lineRule="auto"/>
+    </w:pPr>
+    <w:rPr>
+      <w:rFonts w:ascii="Courier New" w:eastAsia="Times New Roman" w:hAnsi="Courier New" w:cs="Courier New"/>
+      <w:kern w:val="0"/>
+      <w:sz w:val="20"/>
+      <w:szCs w:val="20"/>
+      <w14:ligatures w14:val="none"/>
+    </w:rPr>
+  </w:style>
+  <w:style w:type="character" w:customStyle="1" w:styleId="HTMLPreformattedChar">
+    <w:name w:val="HTML Preformatted Char"/>
+    <w:basedOn w:val="DefaultParagraphFont"/>
+    <w:link w:val="HTMLPreformatted"/>
+    <w:uiPriority w:val="99"/>
+    <w:semiHidden/>
+    <w:rsid w:val="00483158"/>
+    <w:rPr>
+      <w:rFonts w:ascii="Courier New" w:eastAsia="Times New Roman" w:hAnsi="Courier New" w:cs="Courier New"/>
+      <w:kern w:val="0"/>
+      <w:sz w:val="20"/>
+      <w:szCs w:val="20"/>
+      <w14:ligatures w14:val="none"/>
+    </w:rPr>
+  </w:style>
+  <w:style w:type="character" w:styleId="HTMLCode">
+    <w:name w:val="HTML Code"/>
+    <w:basedOn w:val="DefaultParagraphFont"/>
+    <w:uiPriority w:val="99"/>
+    <w:semiHidden/>
+    <w:unhideWhenUsed/>
+    <w:rsid w:val="00483158"/>
+    <w:rPr>
+      <w:rFonts w:ascii="Courier New" w:eastAsia="Times New Roman" w:hAnsi="Courier New" w:cs="Courier New"/>
+      <w:sz w:val="20"/>
+      <w:szCs w:val="20"/>
+    </w:rPr>
+  </w:style>
 </w:styles>
 </file>
 

</xml_diff>